<commit_message>
Corregir inventario de generadores y transformador de generadores
- Agregar el generador de secado (Perkins 2200 Series, 395 kVA, 220 V,
  1800 rpm), equipo independiente ubicado junto al Stamford/Hyundai.
  El inventario pasa de 6 a 7 equipos y de 3.065 a 3.460 kVA.
- Fijar en 440 V la tension de los generadores 001 al 005; el de secado
  queda como el unico equipo a 220 V.
- Registrar el transformador de generadores con primario de 13.200 V
  segun datasheet y secundario de 220 V; potencia nominal pendiente.
- Documentar la coexistencia de dos niveles de tension primaria en
  planta (13.200 V en generadores y 13,8 kV en comedor).

Co-Authored-By: Claude Opus 5 <noreply@anthropic.com>
Claude-Session: https://claude.ai/code/session_017Ah5tanyfPUVfcgGMELNSN
</commit_message>
<xml_diff>
--- a/salidas/Inventario_Generadores_Transformadores_y_Cubetos.docx
+++ b/salidas/Inventario_Generadores_Transformadores_y_Cubetos.docx
@@ -86,7 +86,7 @@
         </w:tc>
         <w:tc>
           <w:tcPr>
-            <w:tcW w:type="dxa" w:w="2268"/>
+            <w:tcW w:type="dxa" w:w="2494"/>
             <w:shd w:val="clear" w:fill="1F3B63"/>
           </w:tcPr>
           <w:p>
@@ -146,7 +146,7 @@
         </w:tc>
         <w:tc>
           <w:tcPr>
-            <w:tcW w:type="dxa" w:w="1247"/>
+            <w:tcW w:type="dxa" w:w="1134"/>
             <w:shd w:val="clear" w:fill="1F3B63"/>
           </w:tcPr>
           <w:p>
@@ -225,7 +225,7 @@
         </w:tc>
         <w:tc>
           <w:tcPr>
-            <w:tcW w:type="dxa" w:w="2268"/>
+            <w:tcW w:type="dxa" w:w="2494"/>
           </w:tcPr>
           <w:p>
             <w:pPr>
@@ -276,7 +276,7 @@
         </w:tc>
         <w:tc>
           <w:tcPr>
-            <w:tcW w:type="dxa" w:w="1247"/>
+            <w:tcW w:type="dxa" w:w="1134"/>
           </w:tcPr>
           <w:p>
             <w:pPr>
@@ -346,7 +346,7 @@
         </w:tc>
         <w:tc>
           <w:tcPr>
-            <w:tcW w:type="dxa" w:w="2268"/>
+            <w:tcW w:type="dxa" w:w="2494"/>
           </w:tcPr>
           <w:p>
             <w:pPr>
@@ -397,7 +397,7 @@
         </w:tc>
         <w:tc>
           <w:tcPr>
-            <w:tcW w:type="dxa" w:w="1247"/>
+            <w:tcW w:type="dxa" w:w="1134"/>
           </w:tcPr>
           <w:p>
             <w:pPr>
@@ -467,7 +467,7 @@
         </w:tc>
         <w:tc>
           <w:tcPr>
-            <w:tcW w:type="dxa" w:w="2268"/>
+            <w:tcW w:type="dxa" w:w="2494"/>
           </w:tcPr>
           <w:p>
             <w:pPr>
@@ -518,7 +518,7 @@
         </w:tc>
         <w:tc>
           <w:tcPr>
-            <w:tcW w:type="dxa" w:w="1247"/>
+            <w:tcW w:type="dxa" w:w="1134"/>
           </w:tcPr>
           <w:p>
             <w:pPr>
@@ -588,7 +588,7 @@
         </w:tc>
         <w:tc>
           <w:tcPr>
-            <w:tcW w:type="dxa" w:w="2268"/>
+            <w:tcW w:type="dxa" w:w="2494"/>
           </w:tcPr>
           <w:p>
             <w:pPr>
@@ -639,7 +639,7 @@
         </w:tc>
         <w:tc>
           <w:tcPr>
-            <w:tcW w:type="dxa" w:w="1247"/>
+            <w:tcW w:type="dxa" w:w="1134"/>
           </w:tcPr>
           <w:p>
             <w:pPr>
@@ -709,7 +709,7 @@
         </w:tc>
         <w:tc>
           <w:tcPr>
-            <w:tcW w:type="dxa" w:w="2268"/>
+            <w:tcW w:type="dxa" w:w="2494"/>
           </w:tcPr>
           <w:p>
             <w:pPr>
@@ -760,7 +760,7 @@
         </w:tc>
         <w:tc>
           <w:tcPr>
-            <w:tcW w:type="dxa" w:w="1247"/>
+            <w:tcW w:type="dxa" w:w="1134"/>
           </w:tcPr>
           <w:p>
             <w:pPr>
@@ -771,7 +771,7 @@
               <w:rPr>
                 <w:sz w:val="19"/>
               </w:rPr>
-              <w:t>220 (verificar)</w:t>
+              <w:t>440</w:t>
             </w:r>
           </w:p>
         </w:tc>
@@ -830,7 +830,128 @@
         </w:tc>
         <w:tc>
           <w:tcPr>
-            <w:tcW w:type="dxa" w:w="2268"/>
+            <w:tcW w:type="dxa" w:w="2494"/>
+          </w:tcPr>
+          <w:p>
+            <w:pPr>
+              <w:jc w:val="center"/>
+            </w:pPr>
+            <w:r/>
+            <w:r>
+              <w:rPr>
+                <w:sz w:val="19"/>
+              </w:rPr>
+              <w:t>Generador de secado — Perkins</w:t>
+            </w:r>
+          </w:p>
+        </w:tc>
+        <w:tc>
+          <w:tcPr>
+            <w:tcW w:type="dxa" w:w="1474"/>
+          </w:tcPr>
+          <w:p>
+            <w:pPr>
+              <w:jc w:val="center"/>
+            </w:pPr>
+            <w:r/>
+            <w:r>
+              <w:rPr>
+                <w:sz w:val="19"/>
+              </w:rPr>
+              <w:t>2200 Series</w:t>
+            </w:r>
+          </w:p>
+        </w:tc>
+        <w:tc>
+          <w:tcPr>
+            <w:tcW w:type="dxa" w:w="1134"/>
+          </w:tcPr>
+          <w:p>
+            <w:pPr>
+              <w:jc w:val="center"/>
+            </w:pPr>
+            <w:r/>
+            <w:r>
+              <w:rPr>
+                <w:sz w:val="19"/>
+              </w:rPr>
+              <w:t>395</w:t>
+            </w:r>
+          </w:p>
+        </w:tc>
+        <w:tc>
+          <w:tcPr>
+            <w:tcW w:type="dxa" w:w="1134"/>
+          </w:tcPr>
+          <w:p>
+            <w:pPr>
+              <w:jc w:val="center"/>
+            </w:pPr>
+            <w:r/>
+            <w:r>
+              <w:rPr>
+                <w:sz w:val="19"/>
+              </w:rPr>
+              <w:t>220</w:t>
+            </w:r>
+          </w:p>
+        </w:tc>
+        <w:tc>
+          <w:tcPr>
+            <w:tcW w:type="dxa" w:w="1247"/>
+          </w:tcPr>
+          <w:p>
+            <w:pPr>
+              <w:jc w:val="center"/>
+            </w:pPr>
+            <w:r/>
+            <w:r>
+              <w:rPr>
+                <w:sz w:val="19"/>
+              </w:rPr>
+              <w:t>1800</w:t>
+            </w:r>
+          </w:p>
+        </w:tc>
+        <w:tc>
+          <w:tcPr>
+            <w:tcW w:type="dxa" w:w="1134"/>
+          </w:tcPr>
+          <w:p>
+            <w:pPr>
+              <w:jc w:val="center"/>
+            </w:pPr>
+            <w:r/>
+            <w:r>
+              <w:rPr>
+                <w:sz w:val="19"/>
+              </w:rPr>
+              <w:t>Diésel</w:t>
+            </w:r>
+          </w:p>
+        </w:tc>
+      </w:tr>
+      <w:tr>
+        <w:tc>
+          <w:tcPr>
+            <w:tcW w:type="dxa" w:w="680"/>
+          </w:tcPr>
+          <w:p>
+            <w:pPr>
+              <w:jc w:val="left"/>
+            </w:pPr>
+            <w:r/>
+            <w:r>
+              <w:rPr>
+                <w:sz w:val="19"/>
+              </w:rPr>
+              <w:t>7</w:t>
+            </w:r>
+          </w:p>
+        </w:tc>
+        <w:tc>
+          <w:tcPr>
+            <w:tcW w:type="dxa" w:w="2494"/>
           </w:tcPr>
           <w:p>
             <w:pPr>
@@ -881,7 +1002,7 @@
         </w:tc>
         <w:tc>
           <w:tcPr>
-            <w:tcW w:type="dxa" w:w="1247"/>
+            <w:tcW w:type="dxa" w:w="1134"/>
           </w:tcPr>
           <w:p>
             <w:pPr>
@@ -938,13 +1059,13 @@
         <w:rPr>
           <w:b/>
         </w:rPr>
-        <w:t xml:space="preserve">Observación: </w:t>
+        <w:t xml:space="preserve">Observaciones: </w:t>
       </w:r>
       <w:r>
         <w:rPr>
           <w:sz w:val="20"/>
         </w:rPr>
-        <w:t>el generador 005 (Perkins 2200 Series, 395 kVA) es el único registrado a 220 V, mientras que los demás Perkins operan a 440 V. Se recomienda verificar en placa si corresponde a 220 V o si existe un error de registro, ya que los cinco equipos son del mismo modelo.</w:t>
+        <w:t>los generadores 001 al 005 y el generador Stamford / Hyundai operan a 440 V. El generador de secado, ubicado junto al Stamford / Hyundai, es el único que opera a 220 V; se trata de un equipo independiente del generador 005, aunque ambos comparten marca, modelo (Perkins 2200 Series) y potencia (395 kVA). En el caso del Stamford / Hyundai se consigna la referencia X18C112717 como identificador de equipo, dado que no declara una denominación de serie comparable a la de los Perkins.</w:t>
       </w:r>
     </w:p>
     <w:p>
@@ -955,7 +1076,7 @@
         <w:t xml:space="preserve">Potencia total instalada: </w:t>
       </w:r>
       <w:r>
-        <w:t>3.065 kVA (suma de los seis equipos).</w:t>
+        <w:t>3.460 kVA (suma de los siete equipos).</w:t>
       </w:r>
     </w:p>
     <w:p>
@@ -971,7 +1092,7 @@
     </w:p>
     <w:p>
       <w:r>
-        <w:t>El sistema de generación se encuentra referido a una tensión de distribución de 13.200 V (13,2 kV) en el lado primario.</w:t>
+        <w:t>El transformador asociado a los generadores opera con una tensión primaria de 13.200 V (13,2 kV), valor tomado de la hoja de datos (datasheet) del equipo.</w:t>
       </w:r>
     </w:p>
     <w:tbl>
@@ -1159,7 +1280,7 @@
               <w:rPr>
                 <w:sz w:val="19"/>
               </w:rPr>
-              <w:t>13.200 V (13,2 kV)</w:t>
+              <w:t>13.200 V (13,2 kV) — según datasheet</w:t>
             </w:r>
           </w:p>
         </w:tc>
@@ -1176,7 +1297,7 @@
               <w:rPr>
                 <w:sz w:val="19"/>
               </w:rPr>
-              <w:t>—</w:t>
+              <w:t>220 V</w:t>
             </w:r>
           </w:p>
         </w:tc>
@@ -1193,7 +1314,7 @@
               <w:rPr>
                 <w:sz w:val="19"/>
               </w:rPr>
-              <w:t>—</w:t>
+              <w:t>Por determinar</w:t>
             </w:r>
           </w:p>
         </w:tc>
@@ -1210,7 +1331,7 @@
               <w:rPr>
                 <w:sz w:val="19"/>
               </w:rPr>
-              <w:t>Referencia de acople a red</w:t>
+              <w:t>Acople de generación a red</w:t>
             </w:r>
           </w:p>
         </w:tc>
@@ -1430,13 +1551,13 @@
         <w:rPr>
           <w:b/>
         </w:rPr>
-        <w:t xml:space="preserve">Observación técnica: </w:t>
+        <w:t xml:space="preserve">Observaciones técnicas: </w:t>
       </w:r>
       <w:r>
         <w:rPr>
           <w:sz w:val="20"/>
         </w:rPr>
-        <w:t>se registra el banco como "en serie" según lo indicado en campo. Un banco trifásico de 3 × 250 kVA que entrega 750 kVA corresponde normalmente a una conexión trifásica (delta o estrella) de tres unidades monofásicas, no a una conexión en serie. Se recomienda confirmar el diagrama unifilar antes de usar este dato para cálculos de carga o de protecciones.</w:t>
+        <w:t>(a) El transformador de generadores trabaja a 13.200 V en el primario y 220 V en el secundario; su potencia nominal no figura en el registro disponible y debe completarse desde la placa o el datasheet. (b) Los transformadores del área de comedor operan con primario de 13,8 kV, nivel distinto al de 13.200 V del transformador de generadores, lo que indica que ambos grupos responden a alimentaciones o niveles de distribución diferentes. (c) El banco trifásico se registra como "en serie" según lo indicado en campo; un banco de 3 × 250 kVA que entrega 750 kVA corresponde normalmente a una conexión trifásica (delta o estrella) de tres unidades monofásicas. Se recomienda confirmar el diagrama unifilar antes de usar este dato para cálculos de carga o de protecciones.</w:t>
       </w:r>
     </w:p>
     <w:p>
@@ -2918,7 +3039,7 @@
               <w:rPr>
                 <w:sz w:val="19"/>
               </w:rPr>
-              <w:t>Tensión del generador 005 inconsistente respecto a equipos idénticos.</w:t>
+              <w:t>No se dispone de la potencia nominal (kVA) del transformador de generadores.</w:t>
             </w:r>
           </w:p>
         </w:tc>
@@ -2935,7 +3056,7 @@
               <w:rPr>
                 <w:sz w:val="19"/>
               </w:rPr>
-              <w:t>Verificar placa de características del equipo.</w:t>
+              <w:t>Completar el dato desde la placa o el datasheet del equipo.</w:t>
             </w:r>
           </w:p>
         </w:tc>
@@ -3023,6 +3144,76 @@
                 <w:sz w:val="19"/>
               </w:rPr>
               <w:t>Media</w:t>
+            </w:r>
+          </w:p>
+        </w:tc>
+      </w:tr>
+      <w:tr>
+        <w:tc>
+          <w:tcPr>
+            <w:tcW w:type="dxa" w:w="680"/>
+          </w:tcPr>
+          <w:p>
+            <w:pPr>
+              <w:jc w:val="left"/>
+            </w:pPr>
+            <w:r/>
+            <w:r>
+              <w:rPr>
+                <w:sz w:val="19"/>
+              </w:rPr>
+              <w:t>6</w:t>
+            </w:r>
+          </w:p>
+        </w:tc>
+        <w:tc>
+          <w:tcPr>
+            <w:tcW w:type="dxa" w:w="3402"/>
+          </w:tcPr>
+          <w:p>
+            <w:pPr>
+              <w:jc w:val="center"/>
+            </w:pPr>
+            <w:r/>
+            <w:r>
+              <w:rPr>
+                <w:sz w:val="19"/>
+              </w:rPr>
+              <w:t>Coexisten dos niveles de tensión primaria en planta: 13.200 V (generadores) y 13,8 kV (comedor).</w:t>
+            </w:r>
+          </w:p>
+        </w:tc>
+        <w:tc>
+          <w:tcPr>
+            <w:tcW w:type="dxa" w:w="3628"/>
+          </w:tcPr>
+          <w:p>
+            <w:pPr>
+              <w:jc w:val="center"/>
+            </w:pPr>
+            <w:r/>
+            <w:r>
+              <w:rPr>
+                <w:sz w:val="19"/>
+              </w:rPr>
+              <w:t>Documentar en el diagrama unifilar la separación entre ambas alimentaciones.</w:t>
+            </w:r>
+          </w:p>
+        </w:tc>
+        <w:tc>
+          <w:tcPr>
+            <w:tcW w:type="dxa" w:w="1361"/>
+          </w:tcPr>
+          <w:p>
+            <w:pPr>
+              <w:jc w:val="center"/>
+            </w:pPr>
+            <w:r/>
+            <w:r>
+              <w:rPr>
+                <w:sz w:val="19"/>
+              </w:rPr>
+              <w:t>Baja</w:t>
             </w:r>
           </w:p>
         </w:tc>

</xml_diff>

<commit_message>
Reestructurar la seccion de cubetos y retirar las observaciones tecnicas
- Eliminar el parrafo de observaciones tecnicas del apartado de
  transformadores; sus tres pendientes ya figuran en la tabla de
  conclusiones y recomendaciones.
- Quitar el salto de pagina para que la verificacion de cubetos siga
  directamente al apartado de transformadores.
- Consolidar la conversion de galones y el calculo del cubeto en una
  sola tabla con capacidad del tanque, medidas tomadas y volumen
  resultante, seguida del desarrollo detallado del calculo.
- Suprimir el factor de conversion duplicado y renumerar los
  subapartados de la seccion 3.

Co-Authored-By: Claude Opus 5 <noreply@anthropic.com>
Claude-Session: https://claude.ai/code/session_017Ah5tanyfPUVfcgGMELNSN
</commit_message>
<xml_diff>
--- a/salidas/Inventario_Generadores_Transformadores_y_Cubetos.docx
+++ b/salidas/Inventario_Generadores_Transformadores_y_Cubetos.docx
@@ -1547,25 +1547,6 @@
     </w:tbl>
     <w:p/>
     <w:p>
-      <w:r>
-        <w:rPr>
-          <w:b/>
-        </w:rPr>
-        <w:t xml:space="preserve">Observaciones técnicas: </w:t>
-      </w:r>
-      <w:r>
-        <w:rPr>
-          <w:sz w:val="20"/>
-        </w:rPr>
-        <w:t>(a) El transformador de generadores trabaja a 13.200 V en el primario y 220 V en el secundario; su potencia nominal no figura en el registro disponible y debe completarse desde la placa o el datasheet. (b) Los transformadores del área de comedor operan con primario de 13,8 kV, nivel distinto al de 13.200 V del transformador de generadores, lo que indica que ambos grupos responden a alimentaciones o niveles de distribución diferentes. (c) El banco trifásico se registra como "en serie" según lo indicado en campo; un banco de 3 × 250 kVA que entrega 750 kVA corresponde normalmente a una conexión trifásica (delta o estrella) de tres unidades monofásicas. Se recomienda confirmar el diagrama unifilar antes de usar este dato para cálculos de carga o de protecciones.</w:t>
-      </w:r>
-    </w:p>
-    <w:p>
-      <w:r>
-        <w:br w:type="page"/>
-      </w:r>
-    </w:p>
-    <w:p>
       <w:pPr>
         <w:pStyle w:val="Heading1"/>
       </w:pPr>
@@ -1600,25 +1581,20 @@
         <w:rPr>
           <w:color w:val="1F3B63"/>
         </w:rPr>
-        <w:t>3.2 Factor de conversión</w:t>
+        <w:t>3.2 Capacidad de los tanques, medidas del cubeto y volumen resultante</w:t>
       </w:r>
     </w:p>
     <w:p>
       <w:r>
-        <w:t>1 galón estadounidense = 3,785411784 litros = 0,003785412 m³</w:t>
+        <w:t>Factor de conversión aplicado: 1 galón estadounidense = 3,785411784 litros = 0,003785412 m³.</w:t>
       </w:r>
     </w:p>
     <w:p>
-      <w:pPr>
-        <w:pStyle w:val="Heading2"/>
-      </w:pPr>
       <w:r>
-        <w:rPr>
-          <w:color w:val="1F3B63"/>
-        </w:rPr>
-        <w:t>3.3 Conversión del volumen de los tanques</w:t>
+        <w:t>Volumen del cubeto: V = Largo × Ancho × Alto.</w:t>
       </w:r>
     </w:p>
+    <w:p/>
     <w:tbl>
       <w:tblPr>
         <w:tblStyle w:val="TableGrid"/>
@@ -1627,16 +1603,15 @@
         <w:tblLook w:firstColumn="1" w:firstRow="1" w:lastColumn="0" w:lastRow="0" w:noHBand="0" w:noVBand="1" w:val="04A0"/>
       </w:tblPr>
       <w:tblGrid>
-        <w:gridCol w:w="1994"/>
-        <w:gridCol w:w="1994"/>
-        <w:gridCol w:w="1994"/>
-        <w:gridCol w:w="1994"/>
-        <w:gridCol w:w="1994"/>
+        <w:gridCol w:w="2493"/>
+        <w:gridCol w:w="2493"/>
+        <w:gridCol w:w="2493"/>
+        <w:gridCol w:w="2493"/>
       </w:tblGrid>
       <w:tr>
         <w:tc>
           <w:tcPr>
-            <w:tcW w:type="dxa" w:w="2835"/>
+            <w:tcW w:type="dxa" w:w="2154"/>
             <w:shd w:val="clear" w:fill="1F3B63"/>
           </w:tcPr>
           <w:p>
@@ -1656,7 +1631,7 @@
         </w:tc>
         <w:tc>
           <w:tcPr>
-            <w:tcW w:type="dxa" w:w="1701"/>
+            <w:tcW w:type="dxa" w:w="3061"/>
             <w:shd w:val="clear" w:fill="1F3B63"/>
           </w:tcPr>
           <w:p>
@@ -1670,13 +1645,13 @@
                 <w:color w:val="FFFFFF"/>
                 <w:sz w:val="19"/>
               </w:rPr>
-              <w:t>Volumen (gal)</w:t>
+              <w:t>Capacidad del tanque</w:t>
             </w:r>
           </w:p>
         </w:tc>
         <w:tc>
           <w:tcPr>
-            <w:tcW w:type="dxa" w:w="1814"/>
+            <w:tcW w:type="dxa" w:w="2835"/>
             <w:shd w:val="clear" w:fill="1F3B63"/>
           </w:tcPr>
           <w:p>
@@ -1690,13 +1665,13 @@
                 <w:color w:val="FFFFFF"/>
                 <w:sz w:val="19"/>
               </w:rPr>
-              <w:t>Volumen (L)</w:t>
+              <w:t>Medidas del cubeto (L × A × H)</w:t>
             </w:r>
           </w:p>
         </w:tc>
         <w:tc>
           <w:tcPr>
-            <w:tcW w:type="dxa" w:w="1701"/>
+            <w:tcW w:type="dxa" w:w="1928"/>
             <w:shd w:val="clear" w:fill="1F3B63"/>
           </w:tcPr>
           <w:p>
@@ -1710,27 +1685,7 @@
                 <w:color w:val="FFFFFF"/>
                 <w:sz w:val="19"/>
               </w:rPr>
-              <w:t>Volumen (m³)</w:t>
-            </w:r>
-          </w:p>
-        </w:tc>
-        <w:tc>
-          <w:tcPr>
-            <w:tcW w:type="dxa" w:w="2494"/>
-            <w:shd w:val="clear" w:fill="1F3B63"/>
-          </w:tcPr>
-          <w:p>
-            <w:pPr>
-              <w:jc w:val="center"/>
-            </w:pPr>
-            <w:r/>
-            <w:r>
-              <w:rPr>
-                <w:b/>
-                <w:color w:val="FFFFFF"/>
-                <w:sz w:val="19"/>
-              </w:rPr>
-              <w:t>Capacidad exigida 110 % (m³)</w:t>
+              <w:t>Volumen del cubeto</w:t>
             </w:r>
           </w:p>
         </w:tc>
@@ -1738,7 +1693,7 @@
       <w:tr>
         <w:tc>
           <w:tcPr>
-            <w:tcW w:type="dxa" w:w="2835"/>
+            <w:tcW w:type="dxa" w:w="2154"/>
           </w:tcPr>
           <w:p>
             <w:pPr>
@@ -1755,7 +1710,7 @@
         </w:tc>
         <w:tc>
           <w:tcPr>
-            <w:tcW w:type="dxa" w:w="1701"/>
+            <w:tcW w:type="dxa" w:w="3061"/>
           </w:tcPr>
           <w:p>
             <w:pPr>
@@ -1766,13 +1721,13 @@
               <w:rPr>
                 <w:sz w:val="19"/>
               </w:rPr>
-              <w:t>5.800</w:t>
+              <w:t>5.800 gal = 21.955,39 L = 21,955 m³</w:t>
             </w:r>
           </w:p>
         </w:tc>
         <w:tc>
           <w:tcPr>
-            <w:tcW w:type="dxa" w:w="1814"/>
+            <w:tcW w:type="dxa" w:w="2835"/>
           </w:tcPr>
           <w:p>
             <w:pPr>
@@ -1783,13 +1738,13 @@
               <w:rPr>
                 <w:sz w:val="19"/>
               </w:rPr>
-              <w:t>21.955,39</w:t>
+              <w:t>6,00 m × 6,00 m × 0,60 m</w:t>
             </w:r>
           </w:p>
         </w:tc>
         <w:tc>
           <w:tcPr>
-            <w:tcW w:type="dxa" w:w="1701"/>
+            <w:tcW w:type="dxa" w:w="1928"/>
           </w:tcPr>
           <w:p>
             <w:pPr>
@@ -1800,24 +1755,7 @@
               <w:rPr>
                 <w:sz w:val="19"/>
               </w:rPr>
-              <w:t>21,955</w:t>
-            </w:r>
-          </w:p>
-        </w:tc>
-        <w:tc>
-          <w:tcPr>
-            <w:tcW w:type="dxa" w:w="2494"/>
-          </w:tcPr>
-          <w:p>
-            <w:pPr>
-              <w:jc w:val="center"/>
-            </w:pPr>
-            <w:r/>
-            <w:r>
-              <w:rPr>
-                <w:sz w:val="19"/>
-              </w:rPr>
-              <w:t>24,151</w:t>
+              <w:t>21,600 m³</w:t>
             </w:r>
           </w:p>
         </w:tc>
@@ -1825,7 +1763,7 @@
       <w:tr>
         <w:tc>
           <w:tcPr>
-            <w:tcW w:type="dxa" w:w="2835"/>
+            <w:tcW w:type="dxa" w:w="2154"/>
           </w:tcPr>
           <w:p>
             <w:pPr>
@@ -1842,7 +1780,7 @@
         </w:tc>
         <w:tc>
           <w:tcPr>
-            <w:tcW w:type="dxa" w:w="1701"/>
+            <w:tcW w:type="dxa" w:w="3061"/>
           </w:tcPr>
           <w:p>
             <w:pPr>
@@ -1853,13 +1791,13 @@
               <w:rPr>
                 <w:sz w:val="19"/>
               </w:rPr>
-              <w:t>10.000</w:t>
+              <w:t>10.000 gal = 37.854,12 L = 37,854 m³</w:t>
             </w:r>
           </w:p>
         </w:tc>
         <w:tc>
           <w:tcPr>
-            <w:tcW w:type="dxa" w:w="1814"/>
+            <w:tcW w:type="dxa" w:w="2835"/>
           </w:tcPr>
           <w:p>
             <w:pPr>
@@ -1870,13 +1808,13 @@
               <w:rPr>
                 <w:sz w:val="19"/>
               </w:rPr>
-              <w:t>37.854,12</w:t>
+              <w:t>8,83 m × 5,10 m × 0,95 m</w:t>
             </w:r>
           </w:p>
         </w:tc>
         <w:tc>
           <w:tcPr>
-            <w:tcW w:type="dxa" w:w="1701"/>
+            <w:tcW w:type="dxa" w:w="1928"/>
           </w:tcPr>
           <w:p>
             <w:pPr>
@@ -1887,29 +1825,13 @@
               <w:rPr>
                 <w:sz w:val="19"/>
               </w:rPr>
-              <w:t>37,854</w:t>
-            </w:r>
-          </w:p>
-        </w:tc>
-        <w:tc>
-          <w:tcPr>
-            <w:tcW w:type="dxa" w:w="2494"/>
-          </w:tcPr>
-          <w:p>
-            <w:pPr>
-              <w:jc w:val="center"/>
-            </w:pPr>
-            <w:r/>
-            <w:r>
-              <w:rPr>
-                <w:sz w:val="19"/>
-              </w:rPr>
-              <w:t>41,640</w:t>
+              <w:t>42,781 m³</w:t>
             </w:r>
           </w:p>
         </w:tc>
       </w:tr>
     </w:tbl>
+    <w:p/>
     <w:p>
       <w:pPr>
         <w:pStyle w:val="Heading2"/>
@@ -1918,315 +1840,7 @@
         <w:rPr>
           <w:color w:val="1F3B63"/>
         </w:rPr>
-        <w:t>3.4 Cálculo del volumen de los cubetos</w:t>
-      </w:r>
-    </w:p>
-    <w:p>
-      <w:r>
-        <w:t>Fórmula: V = Largo × Ancho × Alto</w:t>
-      </w:r>
-    </w:p>
-    <w:tbl>
-      <w:tblPr>
-        <w:tblStyle w:val="TableGrid"/>
-        <w:tblW w:type="auto" w:w="0"/>
-        <w:jc w:val="center"/>
-        <w:tblLook w:firstColumn="1" w:firstRow="1" w:lastColumn="0" w:lastRow="0" w:noHBand="0" w:noVBand="1" w:val="04A0"/>
-      </w:tblPr>
-      <w:tblGrid>
-        <w:gridCol w:w="1994"/>
-        <w:gridCol w:w="1994"/>
-        <w:gridCol w:w="1994"/>
-        <w:gridCol w:w="1994"/>
-        <w:gridCol w:w="1994"/>
-      </w:tblGrid>
-      <w:tr>
-        <w:tc>
-          <w:tcPr>
-            <w:tcW w:type="dxa" w:w="3061"/>
-            <w:shd w:val="clear" w:fill="1F3B63"/>
-          </w:tcPr>
-          <w:p>
-            <w:pPr>
-              <w:jc w:val="center"/>
-            </w:pPr>
-            <w:r/>
-            <w:r>
-              <w:rPr>
-                <w:b/>
-                <w:color w:val="FFFFFF"/>
-                <w:sz w:val="19"/>
-              </w:rPr>
-              <w:t>Cubeto</w:t>
-            </w:r>
-          </w:p>
-        </w:tc>
-        <w:tc>
-          <w:tcPr>
-            <w:tcW w:type="dxa" w:w="1587"/>
-            <w:shd w:val="clear" w:fill="1F3B63"/>
-          </w:tcPr>
-          <w:p>
-            <w:pPr>
-              <w:jc w:val="center"/>
-            </w:pPr>
-            <w:r/>
-            <w:r>
-              <w:rPr>
-                <w:b/>
-                <w:color w:val="FFFFFF"/>
-                <w:sz w:val="19"/>
-              </w:rPr>
-              <w:t>Largo (m)</w:t>
-            </w:r>
-          </w:p>
-        </w:tc>
-        <w:tc>
-          <w:tcPr>
-            <w:tcW w:type="dxa" w:w="1587"/>
-            <w:shd w:val="clear" w:fill="1F3B63"/>
-          </w:tcPr>
-          <w:p>
-            <w:pPr>
-              <w:jc w:val="center"/>
-            </w:pPr>
-            <w:r/>
-            <w:r>
-              <w:rPr>
-                <w:b/>
-                <w:color w:val="FFFFFF"/>
-                <w:sz w:val="19"/>
-              </w:rPr>
-              <w:t>Ancho (m)</w:t>
-            </w:r>
-          </w:p>
-        </w:tc>
-        <w:tc>
-          <w:tcPr>
-            <w:tcW w:type="dxa" w:w="1587"/>
-            <w:shd w:val="clear" w:fill="1F3B63"/>
-          </w:tcPr>
-          <w:p>
-            <w:pPr>
-              <w:jc w:val="center"/>
-            </w:pPr>
-            <w:r/>
-            <w:r>
-              <w:rPr>
-                <w:b/>
-                <w:color w:val="FFFFFF"/>
-                <w:sz w:val="19"/>
-              </w:rPr>
-              <w:t>Alto (m)</w:t>
-            </w:r>
-          </w:p>
-        </w:tc>
-        <w:tc>
-          <w:tcPr>
-            <w:tcW w:type="dxa" w:w="1814"/>
-            <w:shd w:val="clear" w:fill="1F3B63"/>
-          </w:tcPr>
-          <w:p>
-            <w:pPr>
-              <w:jc w:val="center"/>
-            </w:pPr>
-            <w:r/>
-            <w:r>
-              <w:rPr>
-                <w:b/>
-                <w:color w:val="FFFFFF"/>
-                <w:sz w:val="19"/>
-              </w:rPr>
-              <w:t>Volumen (m³)</w:t>
-            </w:r>
-          </w:p>
-        </w:tc>
-      </w:tr>
-      <w:tr>
-        <w:tc>
-          <w:tcPr>
-            <w:tcW w:type="dxa" w:w="3061"/>
-          </w:tcPr>
-          <w:p>
-            <w:pPr>
-              <w:jc w:val="left"/>
-            </w:pPr>
-            <w:r/>
-            <w:r>
-              <w:rPr>
-                <w:sz w:val="19"/>
-              </w:rPr>
-              <w:t>Cubeto 1 — Tanque 5.800 gal</w:t>
-            </w:r>
-          </w:p>
-        </w:tc>
-        <w:tc>
-          <w:tcPr>
-            <w:tcW w:type="dxa" w:w="1587"/>
-          </w:tcPr>
-          <w:p>
-            <w:pPr>
-              <w:jc w:val="center"/>
-            </w:pPr>
-            <w:r/>
-            <w:r>
-              <w:rPr>
-                <w:sz w:val="19"/>
-              </w:rPr>
-              <w:t>6,00</w:t>
-            </w:r>
-          </w:p>
-        </w:tc>
-        <w:tc>
-          <w:tcPr>
-            <w:tcW w:type="dxa" w:w="1587"/>
-          </w:tcPr>
-          <w:p>
-            <w:pPr>
-              <w:jc w:val="center"/>
-            </w:pPr>
-            <w:r/>
-            <w:r>
-              <w:rPr>
-                <w:sz w:val="19"/>
-              </w:rPr>
-              <w:t>6,00</w:t>
-            </w:r>
-          </w:p>
-        </w:tc>
-        <w:tc>
-          <w:tcPr>
-            <w:tcW w:type="dxa" w:w="1587"/>
-          </w:tcPr>
-          <w:p>
-            <w:pPr>
-              <w:jc w:val="center"/>
-            </w:pPr>
-            <w:r/>
-            <w:r>
-              <w:rPr>
-                <w:sz w:val="19"/>
-              </w:rPr>
-              <w:t>0,60</w:t>
-            </w:r>
-          </w:p>
-        </w:tc>
-        <w:tc>
-          <w:tcPr>
-            <w:tcW w:type="dxa" w:w="1814"/>
-          </w:tcPr>
-          <w:p>
-            <w:pPr>
-              <w:jc w:val="center"/>
-            </w:pPr>
-            <w:r/>
-            <w:r>
-              <w:rPr>
-                <w:sz w:val="19"/>
-              </w:rPr>
-              <w:t>21,600</w:t>
-            </w:r>
-          </w:p>
-        </w:tc>
-      </w:tr>
-      <w:tr>
-        <w:tc>
-          <w:tcPr>
-            <w:tcW w:type="dxa" w:w="3061"/>
-          </w:tcPr>
-          <w:p>
-            <w:pPr>
-              <w:jc w:val="left"/>
-            </w:pPr>
-            <w:r/>
-            <w:r>
-              <w:rPr>
-                <w:sz w:val="19"/>
-              </w:rPr>
-              <w:t>Cubeto 2 — Tanque 10.000 gal</w:t>
-            </w:r>
-          </w:p>
-        </w:tc>
-        <w:tc>
-          <w:tcPr>
-            <w:tcW w:type="dxa" w:w="1587"/>
-          </w:tcPr>
-          <w:p>
-            <w:pPr>
-              <w:jc w:val="center"/>
-            </w:pPr>
-            <w:r/>
-            <w:r>
-              <w:rPr>
-                <w:sz w:val="19"/>
-              </w:rPr>
-              <w:t>8,83</w:t>
-            </w:r>
-          </w:p>
-        </w:tc>
-        <w:tc>
-          <w:tcPr>
-            <w:tcW w:type="dxa" w:w="1587"/>
-          </w:tcPr>
-          <w:p>
-            <w:pPr>
-              <w:jc w:val="center"/>
-            </w:pPr>
-            <w:r/>
-            <w:r>
-              <w:rPr>
-                <w:sz w:val="19"/>
-              </w:rPr>
-              <w:t>5,10</w:t>
-            </w:r>
-          </w:p>
-        </w:tc>
-        <w:tc>
-          <w:tcPr>
-            <w:tcW w:type="dxa" w:w="1587"/>
-          </w:tcPr>
-          <w:p>
-            <w:pPr>
-              <w:jc w:val="center"/>
-            </w:pPr>
-            <w:r/>
-            <w:r>
-              <w:rPr>
-                <w:sz w:val="19"/>
-              </w:rPr>
-              <w:t>0,95</w:t>
-            </w:r>
-          </w:p>
-        </w:tc>
-        <w:tc>
-          <w:tcPr>
-            <w:tcW w:type="dxa" w:w="1814"/>
-          </w:tcPr>
-          <w:p>
-            <w:pPr>
-              <w:jc w:val="center"/>
-            </w:pPr>
-            <w:r/>
-            <w:r>
-              <w:rPr>
-                <w:sz w:val="19"/>
-              </w:rPr>
-              <w:t>42,781</w:t>
-            </w:r>
-          </w:p>
-        </w:tc>
-      </w:tr>
-    </w:tbl>
-    <w:p/>
-    <w:p>
-      <w:r>
-        <w:rPr>
-          <w:b/>
-        </w:rPr>
-        <w:t xml:space="preserve">Cubeto 1: </w:t>
-      </w:r>
-      <w:r>
-        <w:t>6,00 m × 6,00 m × 0,60 m = 21,600 m³</w:t>
+        <w:t>3.3 Desarrollo del cálculo</w:t>
       </w:r>
     </w:p>
     <w:p>
@@ -2234,12 +1848,67 @@
         <w:rPr>
           <w:b/>
         </w:rPr>
-        <w:t xml:space="preserve">Cubeto 2: </w:t>
-      </w:r>
-      <w:r>
-        <w:t>8,83 m × 5,10 m × 0,95 m = 42,781 m³</w:t>
+        <w:t>Tanque 1 — Reservorio de 5.800 galones</w:t>
       </w:r>
     </w:p>
+    <w:p>
+      <w:pPr>
+        <w:pStyle w:val="ListBullet"/>
+      </w:pPr>
+      <w:r>
+        <w:t>Conversión: 5.800 gal × 3,785411784 L/gal = 21.955,39 L = 21,955 m³</w:t>
+      </w:r>
+    </w:p>
+    <w:p>
+      <w:pPr>
+        <w:pStyle w:val="ListBullet"/>
+      </w:pPr>
+      <w:r>
+        <w:t>Volumen del cubeto: 6,00 m × 6,00 m × 0,60 m = 21,600 m³</w:t>
+      </w:r>
+    </w:p>
+    <w:p>
+      <w:pPr>
+        <w:pStyle w:val="ListBullet"/>
+      </w:pPr>
+      <w:r>
+        <w:t>Capacidad exigida (110 %): 21,955 m³ × 1,10 = 24,151 m³</w:t>
+      </w:r>
+    </w:p>
+    <w:p/>
+    <w:p>
+      <w:r>
+        <w:rPr>
+          <w:b/>
+        </w:rPr>
+        <w:t>Tanque 2 — 10.000 galones</w:t>
+      </w:r>
+    </w:p>
+    <w:p>
+      <w:pPr>
+        <w:pStyle w:val="ListBullet"/>
+      </w:pPr>
+      <w:r>
+        <w:t>Conversión: 10.000 gal × 3,785411784 L/gal = 37.854,12 L = 37,854 m³</w:t>
+      </w:r>
+    </w:p>
+    <w:p>
+      <w:pPr>
+        <w:pStyle w:val="ListBullet"/>
+      </w:pPr>
+      <w:r>
+        <w:t>Volumen del cubeto: 8,83 m × 5,10 m × 0,95 m = 42,781 m³</w:t>
+      </w:r>
+    </w:p>
+    <w:p>
+      <w:pPr>
+        <w:pStyle w:val="ListBullet"/>
+      </w:pPr>
+      <w:r>
+        <w:t>Capacidad exigida (110 %): 37,854 m³ × 1,10 = 41,640 m³</w:t>
+      </w:r>
+    </w:p>
+    <w:p/>
     <w:p>
       <w:pPr>
         <w:pStyle w:val="Heading2"/>
@@ -2248,7 +1917,7 @@
         <w:rPr>
           <w:color w:val="1F3B63"/>
         </w:rPr>
-        <w:t>3.5 Resultado de la verificación</w:t>
+        <w:t>3.4 Resultado de la verificación</w:t>
       </w:r>
     </w:p>
     <w:tbl>
@@ -2616,7 +2285,7 @@
         <w:rPr>
           <w:color w:val="1F3B63"/>
         </w:rPr>
-        <w:t>3.6 Análisis de los resultados</w:t>
+        <w:t>3.5 Análisis de los resultados</w:t>
       </w:r>
     </w:p>
     <w:p>
@@ -2700,7 +2369,7 @@
         <w:rPr>
           <w:color w:val="1F3B63"/>
         </w:rPr>
-        <w:t>3.7 Conclusiones y recomendaciones</w:t>
+        <w:t>3.6 Conclusiones y recomendaciones</w:t>
       </w:r>
     </w:p>
     <w:tbl>
@@ -3226,7 +2895,7 @@
           <w:i/>
           <w:sz w:val="19"/>
         </w:rPr>
-        <w:t>Nota final: los cálculos de los apartados 3.3 y 3.4 se basan exclusivamente en las dimensiones proporcionadas. Toda conclusión de cumplimiento queda condicionada a la verificación en campo del volumen neto de retención.</w:t>
+        <w:t>Nota final: los cálculos de los apartados 3.2 y 3.3 se basan exclusivamente en las dimensiones proporcionadas. Toda conclusión de cumplimiento queda condicionada a la verificación en campo del volumen neto de retención.</w:t>
       </w:r>
     </w:p>
     <w:sectPr>

</xml_diff>